<commit_message>
Tidying bits and bobs
</commit_message>
<xml_diff>
--- a/authors/vaibhav-jain-bio.docx
+++ b/authors/vaibhav-jain-bio.docx
@@ -16,13 +16,7 @@
       </w:r>
       <w:proofErr w:type="spellEnd"/>
       <w:r>
-        <w:t>, his ag</w:t>
-      </w:r>
-      <w:r>
-        <w:t>-</w:t>
-      </w:r>
-      <w:r>
-        <w:t>tech venture.</w:t>
+        <w:t>, his ag-tech venture.</w:t>
       </w:r>
     </w:p>
     <w:p>
@@ -56,13 +50,7 @@
       </w:r>
       <w:proofErr w:type="spellEnd"/>
       <w:r>
-        <w:t xml:space="preserve">. In previous lives, he has been a steel trader, a university researcher in India and the </w:t>
-      </w:r>
-      <w:r>
-        <w:t>United States</w:t>
-      </w:r>
-      <w:r>
-        <w:t xml:space="preserve">, and an occasional stand-up comic – a pursuit he </w:t>
+        <w:t xml:space="preserve">. In previous lives, he has been a steel trader, a university researcher in India and the United States, and an occasional stand-up comic – a pursuit he </w:t>
       </w:r>
       <w:r>
         <w:rPr>
@@ -91,16 +79,10 @@
         <w:t>Carbon Sense</w:t>
       </w:r>
       <w:r>
-        <w:t>, Vaibhav write</w:t>
-      </w:r>
-      <w:r>
-        <w:t>s</w:t>
-      </w:r>
-      <w:r>
-        <w:t xml:space="preserve"> about anything even vaguely related to climate change. </w:t>
-      </w:r>
-      <w:r>
-        <w:t>He brings a restless curiosity and a willingness to experiment - qualities that help challenge assumptions and connect ideas across policy, finance, and technology.</w:t>
+        <w:t xml:space="preserve">, Vaibhav writes about anything even vaguely related to climate change. </w:t>
+      </w:r>
+      <w:r>
+        <w:t>He is something of a loose cannon that way – blissfully unaware of his limits but hopefully better for it.</w:t>
       </w:r>
     </w:p>
     <w:p>

</xml_diff>

<commit_message>
Update to V's bio
</commit_message>
<xml_diff>
--- a/authors/vaibhav-jain-bio.docx
+++ b/authors/vaibhav-jain-bio.docx
@@ -82,7 +82,10 @@
         <w:t xml:space="preserve">, Vaibhav writes about anything even vaguely related to climate change. </w:t>
       </w:r>
       <w:r>
-        <w:t>He is something of a loose cannon that way – blissfully unaware of his limits but hopefully better for it.</w:t>
+        <w:rPr>
+          <w:color w:val="000000"/>
+        </w:rPr>
+        <w:t>He brings a restless curiosity and a willingness to experiment - qualities that help challenge assumptions and connect ideas across policy, finance, and technology.</w:t>
       </w:r>
     </w:p>
     <w:p>

</xml_diff>